<commit_message>
modified:   .vscode/settings.json 	new file:   code/python/__pycache__/random_num.cpython-36.pyc 	modified:   code/python/mp_sort.py 	new file:   "~$\347\240\224\347\251\266.docx" 	modified:   "\347\240\224\347\251\266.docx"
</commit_message>
<xml_diff>
--- a/研究.docx
+++ b/研究.docx
@@ -543,7 +543,14 @@
         <w:suppressLineNumbers w:val="0"/>
       </w:pPr>
       <w:r>
-        <w:t>2.1 研究流程</w:t>
+        <w:rPr>
+          <w:rFonts w:hint="eastAsia"/>
+          <w:lang w:val="en-US" w:eastAsia="zh-CN"/>
+        </w:rPr>
+        <w:t>1</w:t>
+      </w:r>
+      <w:r>
+        <w:t>.1 研究流程</w:t>
       </w:r>
     </w:p>
     <w:p>
@@ -640,7 +647,14 @@
         <w:suppressLineNumbers w:val="0"/>
       </w:pPr>
       <w:r>
-        <w:t>2.2 测试环境</w:t>
+        <w:rPr>
+          <w:rFonts w:hint="eastAsia"/>
+          <w:lang w:val="en-US" w:eastAsia="zh-CN"/>
+        </w:rPr>
+        <w:t>1</w:t>
+      </w:r>
+      <w:r>
+        <w:t>.2 测试环境</w:t>
       </w:r>
     </w:p>
     <w:p>
@@ -745,14 +759,14 @@
         <w:t xml:space="preserve"> 3.13</w:t>
       </w:r>
       <w:r>
-        <w:t xml:space="preserve"> / Java__ </w:t>
+        <w:t xml:space="preserve"> / Java</w:t>
       </w:r>
       <w:r>
         <w:rPr>
           <w:rFonts w:hint="eastAsia"/>
           <w:lang w:val="en-US" w:eastAsia="zh-CN"/>
         </w:rPr>
-        <w:t xml:space="preserve">  </w:t>
+        <w:t xml:space="preserve"> 1.8.0_411 </w:t>
       </w:r>
       <w:r>
         <w:t xml:space="preserve">/ </w:t>
@@ -762,19 +776,10 @@
           <w:rFonts w:hint="eastAsia"/>
           <w:lang w:val="en-US" w:eastAsia="zh-CN"/>
         </w:rPr>
-        <w:t xml:space="preserve">C++ 15.1.0 (C++ 17 </w:t>
-      </w:r>
-      <w:bookmarkStart w:id="0" w:name="_GoBack"/>
-      <w:bookmarkEnd w:id="0"/>
-      <w:r>
-        <w:rPr>
-          <w:rFonts w:hint="eastAsia"/>
-          <w:lang w:val="en-US" w:eastAsia="zh-CN"/>
-        </w:rPr>
-        <w:t>)</w:t>
-      </w:r>
-      <w:r>
-        <w:t xml:space="preserve"> / Go__ / JS__</w:t>
+        <w:t>C++ 15.1.0 (C++ 17 )</w:t>
+      </w:r>
+      <w:r>
+        <w:t xml:space="preserve"> / </w:t>
       </w:r>
     </w:p>
     <w:p>
@@ -801,9 +806,20 @@
         <w:keepLines w:val="0"/>
         <w:widowControl/>
         <w:suppressLineNumbers w:val="0"/>
-      </w:pPr>
-      <w:r>
-        <w:t>2.3 评价指标</w:t>
+        <w:rPr>
+          <w:rFonts w:hint="eastAsia" w:eastAsia="宋体"/>
+          <w:lang w:val="en-US" w:eastAsia="zh-CN"/>
+        </w:rPr>
+      </w:pPr>
+      <w:r>
+        <w:rPr>
+          <w:rFonts w:hint="eastAsia"/>
+          <w:lang w:val="en-US" w:eastAsia="zh-CN"/>
+        </w:rPr>
+        <w:t>1</w:t>
+      </w:r>
+      <w:r>
+        <w:t>.3 评价指标</w:t>
       </w:r>
     </w:p>
     <w:p>
@@ -937,6 +953,40 @@
     </w:p>
     <w:p>
       <w:pPr>
+        <w:jc w:val="left"/>
+        <w:rPr>
+          <w:rFonts w:hint="eastAsia" w:ascii="微软雅黑" w:hAnsi="微软雅黑" w:eastAsia="微软雅黑" w:cs="微软雅黑"/>
+          <w:sz w:val="18"/>
+          <w:szCs w:val="18"/>
+          <w:lang w:val="en-US" w:eastAsia="zh-CN"/>
+        </w:rPr>
+        <w:sectPr>
+          <w:pgSz w:w="11906" w:h="16838"/>
+          <w:pgMar w:top="720" w:right="720" w:bottom="720" w:left="720" w:header="851" w:footer="992" w:gutter="0"/>
+          <w:cols w:space="425" w:num="1"/>
+          <w:docGrid w:type="lines" w:linePitch="312" w:charSpace="0"/>
+        </w:sectPr>
+      </w:pPr>
+    </w:p>
+    <w:p>
+      <w:pPr>
+        <w:jc w:val="left"/>
+        <w:rPr>
+          <w:rFonts w:hint="eastAsia" w:ascii="微软雅黑" w:hAnsi="微软雅黑" w:eastAsia="微软雅黑" w:cs="微软雅黑"/>
+          <w:sz w:val="18"/>
+          <w:szCs w:val="18"/>
+          <w:lang w:val="en-US" w:eastAsia="zh-CN"/>
+        </w:rPr>
+        <w:sectPr>
+          <w:pgSz w:w="11906" w:h="16838"/>
+          <w:pgMar w:top="720" w:right="720" w:bottom="720" w:left="720" w:header="851" w:footer="992" w:gutter="0"/>
+          <w:cols w:space="425" w:num="1"/>
+          <w:docGrid w:type="lines" w:linePitch="312" w:charSpace="0"/>
+        </w:sectPr>
+      </w:pPr>
+    </w:p>
+    <w:p>
+      <w:pPr>
         <w:rPr>
           <w:rFonts w:hint="eastAsia"/>
           <w:lang w:val="en-US" w:eastAsia="zh-CN"/>
@@ -2605,7 +2655,1270 @@
     </w:p>
     <w:p>
       <w:pPr>
-        <w:ind w:left="420" w:leftChars="0" w:firstLine="420" w:firstLineChars="0"/>
+        <w:rPr>
+          <w:rFonts w:hint="eastAsia"/>
+          <w:lang w:val="en-US" w:eastAsia="zh-CN"/>
+        </w:rPr>
+      </w:pPr>
+      <w:r>
+        <w:rPr>
+          <w:rFonts w:hint="eastAsia"/>
+          <w:lang w:val="en-US" w:eastAsia="zh-CN"/>
+        </w:rPr>
+        <w:t>python随机数生成代码</w:t>
+      </w:r>
+    </w:p>
+    <w:p>
+      <w:pPr>
+        <w:keepNext w:val="0"/>
+        <w:keepLines w:val="0"/>
+        <w:widowControl/>
+        <w:suppressLineNumbers w:val="0"/>
+        <w:shd w:val="clear" w:fill="1E1E1E"/>
+        <w:spacing w:line="228" w:lineRule="atLeast"/>
+        <w:jc w:val="left"/>
+        <w:rPr>
+          <w:rFonts w:ascii="Consolas" w:hAnsi="Consolas" w:eastAsia="Consolas" w:cs="Consolas"/>
+          <w:b w:val="0"/>
+          <w:bCs w:val="0"/>
+          <w:color w:val="DADADA"/>
+          <w:sz w:val="16"/>
+          <w:szCs w:val="16"/>
+        </w:rPr>
+      </w:pPr>
+      <w:r>
+        <w:rPr>
+          <w:rFonts w:hint="default" w:ascii="Consolas" w:hAnsi="Consolas" w:eastAsia="Consolas" w:cs="Consolas"/>
+          <w:b w:val="0"/>
+          <w:bCs w:val="0"/>
+          <w:color w:val="D8A0DF"/>
+          <w:kern w:val="0"/>
+          <w:sz w:val="16"/>
+          <w:szCs w:val="16"/>
+          <w:shd w:val="clear" w:fill="1E1E1E"/>
+          <w:lang w:val="en-US" w:eastAsia="zh-CN" w:bidi="ar"/>
+        </w:rPr>
+        <w:t>import</w:t>
+      </w:r>
+      <w:r>
+        <w:rPr>
+          <w:rFonts w:hint="default" w:ascii="Consolas" w:hAnsi="Consolas" w:eastAsia="Consolas" w:cs="Consolas"/>
+          <w:b w:val="0"/>
+          <w:bCs w:val="0"/>
+          <w:color w:val="DADADA"/>
+          <w:kern w:val="0"/>
+          <w:sz w:val="16"/>
+          <w:szCs w:val="16"/>
+          <w:shd w:val="clear" w:fill="1E1E1E"/>
+          <w:lang w:val="en-US" w:eastAsia="zh-CN" w:bidi="ar"/>
+        </w:rPr>
+        <w:t xml:space="preserve"> </w:t>
+      </w:r>
+      <w:r>
+        <w:rPr>
+          <w:rFonts w:hint="default" w:ascii="Consolas" w:hAnsi="Consolas" w:eastAsia="Consolas" w:cs="Consolas"/>
+          <w:b w:val="0"/>
+          <w:bCs w:val="0"/>
+          <w:color w:val="C8C8C8"/>
+          <w:kern w:val="0"/>
+          <w:sz w:val="16"/>
+          <w:szCs w:val="16"/>
+          <w:shd w:val="clear" w:fill="1E1E1E"/>
+          <w:lang w:val="en-US" w:eastAsia="zh-CN" w:bidi="ar"/>
+        </w:rPr>
+        <w:t>random</w:t>
+      </w:r>
+    </w:p>
+    <w:p>
+      <w:pPr>
+        <w:keepNext w:val="0"/>
+        <w:keepLines w:val="0"/>
+        <w:widowControl/>
+        <w:suppressLineNumbers w:val="0"/>
+        <w:shd w:val="clear" w:fill="1E1E1E"/>
+        <w:spacing w:line="228" w:lineRule="atLeast"/>
+        <w:jc w:val="left"/>
+        <w:rPr>
+          <w:rFonts w:hint="default" w:ascii="Consolas" w:hAnsi="Consolas" w:eastAsia="Consolas" w:cs="Consolas"/>
+          <w:b w:val="0"/>
+          <w:bCs w:val="0"/>
+          <w:color w:val="DADADA"/>
+          <w:sz w:val="16"/>
+          <w:szCs w:val="16"/>
+        </w:rPr>
+      </w:pPr>
+      <w:r>
+        <w:rPr>
+          <w:rFonts w:hint="default" w:ascii="Consolas" w:hAnsi="Consolas" w:eastAsia="Consolas" w:cs="Consolas"/>
+          <w:b w:val="0"/>
+          <w:bCs w:val="0"/>
+          <w:color w:val="D8A0DF"/>
+          <w:kern w:val="0"/>
+          <w:sz w:val="16"/>
+          <w:szCs w:val="16"/>
+          <w:shd w:val="clear" w:fill="1E1E1E"/>
+          <w:lang w:val="en-US" w:eastAsia="zh-CN" w:bidi="ar"/>
+        </w:rPr>
+        <w:t>import</w:t>
+      </w:r>
+      <w:r>
+        <w:rPr>
+          <w:rFonts w:hint="default" w:ascii="Consolas" w:hAnsi="Consolas" w:eastAsia="Consolas" w:cs="Consolas"/>
+          <w:b w:val="0"/>
+          <w:bCs w:val="0"/>
+          <w:color w:val="DADADA"/>
+          <w:kern w:val="0"/>
+          <w:sz w:val="16"/>
+          <w:szCs w:val="16"/>
+          <w:shd w:val="clear" w:fill="1E1E1E"/>
+          <w:lang w:val="en-US" w:eastAsia="zh-CN" w:bidi="ar"/>
+        </w:rPr>
+        <w:t xml:space="preserve"> </w:t>
+      </w:r>
+      <w:r>
+        <w:rPr>
+          <w:rFonts w:hint="default" w:ascii="Consolas" w:hAnsi="Consolas" w:eastAsia="Consolas" w:cs="Consolas"/>
+          <w:b w:val="0"/>
+          <w:bCs w:val="0"/>
+          <w:color w:val="C8C8C8"/>
+          <w:kern w:val="0"/>
+          <w:sz w:val="16"/>
+          <w:szCs w:val="16"/>
+          <w:shd w:val="clear" w:fill="1E1E1E"/>
+          <w:lang w:val="en-US" w:eastAsia="zh-CN" w:bidi="ar"/>
+        </w:rPr>
+        <w:t>time</w:t>
+      </w:r>
+    </w:p>
+    <w:p>
+      <w:pPr>
+        <w:keepNext w:val="0"/>
+        <w:keepLines w:val="0"/>
+        <w:widowControl/>
+        <w:suppressLineNumbers w:val="0"/>
+        <w:shd w:val="clear" w:fill="1E1E1E"/>
+        <w:spacing w:line="228" w:lineRule="atLeast"/>
+        <w:jc w:val="left"/>
+        <w:rPr>
+          <w:rFonts w:hint="default" w:ascii="Consolas" w:hAnsi="Consolas" w:eastAsia="Consolas" w:cs="Consolas"/>
+          <w:b w:val="0"/>
+          <w:bCs w:val="0"/>
+          <w:color w:val="DADADA"/>
+          <w:sz w:val="16"/>
+          <w:szCs w:val="16"/>
+        </w:rPr>
+      </w:pPr>
+    </w:p>
+    <w:p>
+      <w:pPr>
+        <w:keepNext w:val="0"/>
+        <w:keepLines w:val="0"/>
+        <w:widowControl/>
+        <w:suppressLineNumbers w:val="0"/>
+        <w:shd w:val="clear" w:fill="1E1E1E"/>
+        <w:spacing w:line="228" w:lineRule="atLeast"/>
+        <w:jc w:val="left"/>
+        <w:rPr>
+          <w:rFonts w:hint="default" w:ascii="Consolas" w:hAnsi="Consolas" w:eastAsia="Consolas" w:cs="Consolas"/>
+          <w:b w:val="0"/>
+          <w:bCs w:val="0"/>
+          <w:color w:val="DADADA"/>
+          <w:sz w:val="16"/>
+          <w:szCs w:val="16"/>
+        </w:rPr>
+      </w:pPr>
+      <w:r>
+        <w:rPr>
+          <w:rFonts w:hint="default" w:ascii="Consolas" w:hAnsi="Consolas" w:eastAsia="Consolas" w:cs="Consolas"/>
+          <w:b w:val="0"/>
+          <w:bCs w:val="0"/>
+          <w:color w:val="569CD6"/>
+          <w:kern w:val="0"/>
+          <w:sz w:val="16"/>
+          <w:szCs w:val="16"/>
+          <w:shd w:val="clear" w:fill="1E1E1E"/>
+          <w:lang w:val="en-US" w:eastAsia="zh-CN" w:bidi="ar"/>
+        </w:rPr>
+        <w:t>def</w:t>
+      </w:r>
+      <w:r>
+        <w:rPr>
+          <w:rFonts w:hint="default" w:ascii="Consolas" w:hAnsi="Consolas" w:eastAsia="Consolas" w:cs="Consolas"/>
+          <w:b w:val="0"/>
+          <w:bCs w:val="0"/>
+          <w:color w:val="DADADA"/>
+          <w:kern w:val="0"/>
+          <w:sz w:val="16"/>
+          <w:szCs w:val="16"/>
+          <w:shd w:val="clear" w:fill="1E1E1E"/>
+          <w:lang w:val="en-US" w:eastAsia="zh-CN" w:bidi="ar"/>
+        </w:rPr>
+        <w:t xml:space="preserve"> </w:t>
+      </w:r>
+      <w:r>
+        <w:rPr>
+          <w:rFonts w:hint="default" w:ascii="Consolas" w:hAnsi="Consolas" w:eastAsia="Consolas" w:cs="Consolas"/>
+          <w:b w:val="0"/>
+          <w:bCs w:val="0"/>
+          <w:color w:val="DCDCAA"/>
+          <w:kern w:val="0"/>
+          <w:sz w:val="16"/>
+          <w:szCs w:val="16"/>
+          <w:shd w:val="clear" w:fill="1E1E1E"/>
+          <w:lang w:val="en-US" w:eastAsia="zh-CN" w:bidi="ar"/>
+        </w:rPr>
+        <w:t>get_random_num</w:t>
+      </w:r>
+      <w:r>
+        <w:rPr>
+          <w:rFonts w:hint="default" w:ascii="Consolas" w:hAnsi="Consolas" w:eastAsia="Consolas" w:cs="Consolas"/>
+          <w:b w:val="0"/>
+          <w:bCs w:val="0"/>
+          <w:color w:val="B4B4B4"/>
+          <w:kern w:val="0"/>
+          <w:sz w:val="16"/>
+          <w:szCs w:val="16"/>
+          <w:shd w:val="clear" w:fill="1E1E1E"/>
+          <w:lang w:val="en-US" w:eastAsia="zh-CN" w:bidi="ar"/>
+        </w:rPr>
+        <w:t>(</w:t>
+      </w:r>
+      <w:r>
+        <w:rPr>
+          <w:rFonts w:hint="default" w:ascii="Consolas" w:hAnsi="Consolas" w:eastAsia="Consolas" w:cs="Consolas"/>
+          <w:b w:val="0"/>
+          <w:bCs w:val="0"/>
+          <w:color w:val="9A9A9A"/>
+          <w:kern w:val="0"/>
+          <w:sz w:val="16"/>
+          <w:szCs w:val="16"/>
+          <w:shd w:val="clear" w:fill="1E1E1E"/>
+          <w:lang w:val="en-US" w:eastAsia="zh-CN" w:bidi="ar"/>
+        </w:rPr>
+        <w:t>start</w:t>
+      </w:r>
+      <w:r>
+        <w:rPr>
+          <w:rFonts w:hint="default" w:ascii="Consolas" w:hAnsi="Consolas" w:eastAsia="Consolas" w:cs="Consolas"/>
+          <w:b w:val="0"/>
+          <w:bCs w:val="0"/>
+          <w:color w:val="B4B4B4"/>
+          <w:kern w:val="0"/>
+          <w:sz w:val="16"/>
+          <w:szCs w:val="16"/>
+          <w:shd w:val="clear" w:fill="1E1E1E"/>
+          <w:lang w:val="en-US" w:eastAsia="zh-CN" w:bidi="ar"/>
+        </w:rPr>
+        <w:t>:</w:t>
+      </w:r>
+      <w:r>
+        <w:rPr>
+          <w:rFonts w:hint="default" w:ascii="Consolas" w:hAnsi="Consolas" w:eastAsia="Consolas" w:cs="Consolas"/>
+          <w:b w:val="0"/>
+          <w:bCs w:val="0"/>
+          <w:color w:val="4EC9B0"/>
+          <w:kern w:val="0"/>
+          <w:sz w:val="16"/>
+          <w:szCs w:val="16"/>
+          <w:shd w:val="clear" w:fill="1E1E1E"/>
+          <w:lang w:val="en-US" w:eastAsia="zh-CN" w:bidi="ar"/>
+        </w:rPr>
+        <w:t>int</w:t>
+      </w:r>
+      <w:r>
+        <w:rPr>
+          <w:rFonts w:hint="default" w:ascii="Consolas" w:hAnsi="Consolas" w:eastAsia="Consolas" w:cs="Consolas"/>
+          <w:b w:val="0"/>
+          <w:bCs w:val="0"/>
+          <w:color w:val="B4B4B4"/>
+          <w:kern w:val="0"/>
+          <w:sz w:val="16"/>
+          <w:szCs w:val="16"/>
+          <w:shd w:val="clear" w:fill="1E1E1E"/>
+          <w:lang w:val="en-US" w:eastAsia="zh-CN" w:bidi="ar"/>
+        </w:rPr>
+        <w:t>,</w:t>
+      </w:r>
+      <w:r>
+        <w:rPr>
+          <w:rFonts w:hint="default" w:ascii="Consolas" w:hAnsi="Consolas" w:eastAsia="Consolas" w:cs="Consolas"/>
+          <w:b w:val="0"/>
+          <w:bCs w:val="0"/>
+          <w:color w:val="DADADA"/>
+          <w:kern w:val="0"/>
+          <w:sz w:val="16"/>
+          <w:szCs w:val="16"/>
+          <w:shd w:val="clear" w:fill="1E1E1E"/>
+          <w:lang w:val="en-US" w:eastAsia="zh-CN" w:bidi="ar"/>
+        </w:rPr>
+        <w:t xml:space="preserve"> </w:t>
+      </w:r>
+      <w:r>
+        <w:rPr>
+          <w:rFonts w:hint="default" w:ascii="Consolas" w:hAnsi="Consolas" w:eastAsia="Consolas" w:cs="Consolas"/>
+          <w:b w:val="0"/>
+          <w:bCs w:val="0"/>
+          <w:color w:val="9A9A9A"/>
+          <w:kern w:val="0"/>
+          <w:sz w:val="16"/>
+          <w:szCs w:val="16"/>
+          <w:shd w:val="clear" w:fill="1E1E1E"/>
+          <w:lang w:val="en-US" w:eastAsia="zh-CN" w:bidi="ar"/>
+        </w:rPr>
+        <w:t>end</w:t>
+      </w:r>
+      <w:r>
+        <w:rPr>
+          <w:rFonts w:hint="default" w:ascii="Consolas" w:hAnsi="Consolas" w:eastAsia="Consolas" w:cs="Consolas"/>
+          <w:b w:val="0"/>
+          <w:bCs w:val="0"/>
+          <w:color w:val="B4B4B4"/>
+          <w:kern w:val="0"/>
+          <w:sz w:val="16"/>
+          <w:szCs w:val="16"/>
+          <w:shd w:val="clear" w:fill="1E1E1E"/>
+          <w:lang w:val="en-US" w:eastAsia="zh-CN" w:bidi="ar"/>
+        </w:rPr>
+        <w:t>:</w:t>
+      </w:r>
+      <w:r>
+        <w:rPr>
+          <w:rFonts w:hint="default" w:ascii="Consolas" w:hAnsi="Consolas" w:eastAsia="Consolas" w:cs="Consolas"/>
+          <w:b w:val="0"/>
+          <w:bCs w:val="0"/>
+          <w:color w:val="4EC9B0"/>
+          <w:kern w:val="0"/>
+          <w:sz w:val="16"/>
+          <w:szCs w:val="16"/>
+          <w:shd w:val="clear" w:fill="1E1E1E"/>
+          <w:lang w:val="en-US" w:eastAsia="zh-CN" w:bidi="ar"/>
+        </w:rPr>
+        <w:t>int</w:t>
+      </w:r>
+      <w:r>
+        <w:rPr>
+          <w:rFonts w:hint="default" w:ascii="Consolas" w:hAnsi="Consolas" w:eastAsia="Consolas" w:cs="Consolas"/>
+          <w:b w:val="0"/>
+          <w:bCs w:val="0"/>
+          <w:color w:val="B4B4B4"/>
+          <w:kern w:val="0"/>
+          <w:sz w:val="16"/>
+          <w:szCs w:val="16"/>
+          <w:shd w:val="clear" w:fill="1E1E1E"/>
+          <w:lang w:val="en-US" w:eastAsia="zh-CN" w:bidi="ar"/>
+        </w:rPr>
+        <w:t>,</w:t>
+      </w:r>
+      <w:r>
+        <w:rPr>
+          <w:rFonts w:hint="default" w:ascii="Consolas" w:hAnsi="Consolas" w:eastAsia="Consolas" w:cs="Consolas"/>
+          <w:b w:val="0"/>
+          <w:bCs w:val="0"/>
+          <w:color w:val="DADADA"/>
+          <w:kern w:val="0"/>
+          <w:sz w:val="16"/>
+          <w:szCs w:val="16"/>
+          <w:shd w:val="clear" w:fill="1E1E1E"/>
+          <w:lang w:val="en-US" w:eastAsia="zh-CN" w:bidi="ar"/>
+        </w:rPr>
+        <w:t xml:space="preserve"> </w:t>
+      </w:r>
+      <w:r>
+        <w:rPr>
+          <w:rFonts w:hint="default" w:ascii="Consolas" w:hAnsi="Consolas" w:eastAsia="Consolas" w:cs="Consolas"/>
+          <w:b w:val="0"/>
+          <w:bCs w:val="0"/>
+          <w:color w:val="9A9A9A"/>
+          <w:kern w:val="0"/>
+          <w:sz w:val="16"/>
+          <w:szCs w:val="16"/>
+          <w:shd w:val="clear" w:fill="1E1E1E"/>
+          <w:lang w:val="en-US" w:eastAsia="zh-CN" w:bidi="ar"/>
+        </w:rPr>
+        <w:t>count</w:t>
+      </w:r>
+      <w:r>
+        <w:rPr>
+          <w:rFonts w:hint="default" w:ascii="Consolas" w:hAnsi="Consolas" w:eastAsia="Consolas" w:cs="Consolas"/>
+          <w:b w:val="0"/>
+          <w:bCs w:val="0"/>
+          <w:color w:val="B4B4B4"/>
+          <w:kern w:val="0"/>
+          <w:sz w:val="16"/>
+          <w:szCs w:val="16"/>
+          <w:shd w:val="clear" w:fill="1E1E1E"/>
+          <w:lang w:val="en-US" w:eastAsia="zh-CN" w:bidi="ar"/>
+        </w:rPr>
+        <w:t>:</w:t>
+      </w:r>
+      <w:r>
+        <w:rPr>
+          <w:rFonts w:hint="default" w:ascii="Consolas" w:hAnsi="Consolas" w:eastAsia="Consolas" w:cs="Consolas"/>
+          <w:b w:val="0"/>
+          <w:bCs w:val="0"/>
+          <w:color w:val="4EC9B0"/>
+          <w:kern w:val="0"/>
+          <w:sz w:val="16"/>
+          <w:szCs w:val="16"/>
+          <w:shd w:val="clear" w:fill="1E1E1E"/>
+          <w:lang w:val="en-US" w:eastAsia="zh-CN" w:bidi="ar"/>
+        </w:rPr>
+        <w:t>int</w:t>
+      </w:r>
+      <w:r>
+        <w:rPr>
+          <w:rFonts w:hint="default" w:ascii="Consolas" w:hAnsi="Consolas" w:eastAsia="Consolas" w:cs="Consolas"/>
+          <w:b w:val="0"/>
+          <w:bCs w:val="0"/>
+          <w:color w:val="B4B4B4"/>
+          <w:kern w:val="0"/>
+          <w:sz w:val="16"/>
+          <w:szCs w:val="16"/>
+          <w:shd w:val="clear" w:fill="1E1E1E"/>
+          <w:lang w:val="en-US" w:eastAsia="zh-CN" w:bidi="ar"/>
+        </w:rPr>
+        <w:t>)-&gt;</w:t>
+      </w:r>
+      <w:r>
+        <w:rPr>
+          <w:rFonts w:hint="default" w:ascii="Consolas" w:hAnsi="Consolas" w:eastAsia="Consolas" w:cs="Consolas"/>
+          <w:b w:val="0"/>
+          <w:bCs w:val="0"/>
+          <w:color w:val="4EC9B0"/>
+          <w:kern w:val="0"/>
+          <w:sz w:val="16"/>
+          <w:szCs w:val="16"/>
+          <w:shd w:val="clear" w:fill="1E1E1E"/>
+          <w:lang w:val="en-US" w:eastAsia="zh-CN" w:bidi="ar"/>
+        </w:rPr>
+        <w:t>list</w:t>
+      </w:r>
+      <w:r>
+        <w:rPr>
+          <w:rFonts w:hint="default" w:ascii="Consolas" w:hAnsi="Consolas" w:eastAsia="Consolas" w:cs="Consolas"/>
+          <w:b w:val="0"/>
+          <w:bCs w:val="0"/>
+          <w:color w:val="B4B4B4"/>
+          <w:kern w:val="0"/>
+          <w:sz w:val="16"/>
+          <w:szCs w:val="16"/>
+          <w:shd w:val="clear" w:fill="1E1E1E"/>
+          <w:lang w:val="en-US" w:eastAsia="zh-CN" w:bidi="ar"/>
+        </w:rPr>
+        <w:t>:</w:t>
+      </w:r>
+    </w:p>
+    <w:p>
+      <w:pPr>
+        <w:keepNext w:val="0"/>
+        <w:keepLines w:val="0"/>
+        <w:widowControl/>
+        <w:suppressLineNumbers w:val="0"/>
+        <w:shd w:val="clear" w:fill="1E1E1E"/>
+        <w:spacing w:line="228" w:lineRule="atLeast"/>
+        <w:jc w:val="left"/>
+        <w:rPr>
+          <w:rFonts w:hint="default" w:ascii="Consolas" w:hAnsi="Consolas" w:eastAsia="Consolas" w:cs="Consolas"/>
+          <w:b w:val="0"/>
+          <w:bCs w:val="0"/>
+          <w:color w:val="DADADA"/>
+          <w:sz w:val="16"/>
+          <w:szCs w:val="16"/>
+        </w:rPr>
+      </w:pPr>
+      <w:r>
+        <w:rPr>
+          <w:rFonts w:hint="default" w:ascii="Consolas" w:hAnsi="Consolas" w:eastAsia="Consolas" w:cs="Consolas"/>
+          <w:b w:val="0"/>
+          <w:bCs w:val="0"/>
+          <w:color w:val="DADADA"/>
+          <w:kern w:val="0"/>
+          <w:sz w:val="16"/>
+          <w:szCs w:val="16"/>
+          <w:shd w:val="clear" w:fill="1E1E1E"/>
+          <w:lang w:val="en-US" w:eastAsia="zh-CN" w:bidi="ar"/>
+        </w:rPr>
+        <w:t xml:space="preserve">    </w:t>
+      </w:r>
+      <w:r>
+        <w:rPr>
+          <w:rFonts w:hint="default" w:ascii="Consolas" w:hAnsi="Consolas" w:eastAsia="Consolas" w:cs="Consolas"/>
+          <w:b w:val="0"/>
+          <w:bCs w:val="0"/>
+          <w:color w:val="9CDCFE"/>
+          <w:kern w:val="0"/>
+          <w:sz w:val="16"/>
+          <w:szCs w:val="16"/>
+          <w:shd w:val="clear" w:fill="1E1E1E"/>
+          <w:lang w:val="en-US" w:eastAsia="zh-CN" w:bidi="ar"/>
+        </w:rPr>
+        <w:t>ranum_list</w:t>
+      </w:r>
+      <w:r>
+        <w:rPr>
+          <w:rFonts w:hint="default" w:ascii="Consolas" w:hAnsi="Consolas" w:eastAsia="Consolas" w:cs="Consolas"/>
+          <w:b w:val="0"/>
+          <w:bCs w:val="0"/>
+          <w:color w:val="DADADA"/>
+          <w:kern w:val="0"/>
+          <w:sz w:val="16"/>
+          <w:szCs w:val="16"/>
+          <w:shd w:val="clear" w:fill="1E1E1E"/>
+          <w:lang w:val="en-US" w:eastAsia="zh-CN" w:bidi="ar"/>
+        </w:rPr>
+        <w:t xml:space="preserve"> </w:t>
+      </w:r>
+      <w:r>
+        <w:rPr>
+          <w:rFonts w:hint="default" w:ascii="Consolas" w:hAnsi="Consolas" w:eastAsia="Consolas" w:cs="Consolas"/>
+          <w:b w:val="0"/>
+          <w:bCs w:val="0"/>
+          <w:color w:val="B4B4B4"/>
+          <w:kern w:val="0"/>
+          <w:sz w:val="16"/>
+          <w:szCs w:val="16"/>
+          <w:shd w:val="clear" w:fill="1E1E1E"/>
+          <w:lang w:val="en-US" w:eastAsia="zh-CN" w:bidi="ar"/>
+        </w:rPr>
+        <w:t>=</w:t>
+      </w:r>
+      <w:r>
+        <w:rPr>
+          <w:rFonts w:hint="default" w:ascii="Consolas" w:hAnsi="Consolas" w:eastAsia="Consolas" w:cs="Consolas"/>
+          <w:b w:val="0"/>
+          <w:bCs w:val="0"/>
+          <w:color w:val="DADADA"/>
+          <w:kern w:val="0"/>
+          <w:sz w:val="16"/>
+          <w:szCs w:val="16"/>
+          <w:shd w:val="clear" w:fill="1E1E1E"/>
+          <w:lang w:val="en-US" w:eastAsia="zh-CN" w:bidi="ar"/>
+        </w:rPr>
+        <w:t xml:space="preserve"> </w:t>
+      </w:r>
+      <w:r>
+        <w:rPr>
+          <w:rFonts w:hint="default" w:ascii="Consolas" w:hAnsi="Consolas" w:eastAsia="Consolas" w:cs="Consolas"/>
+          <w:b w:val="0"/>
+          <w:bCs w:val="0"/>
+          <w:color w:val="B4B4B4"/>
+          <w:kern w:val="0"/>
+          <w:sz w:val="16"/>
+          <w:szCs w:val="16"/>
+          <w:shd w:val="clear" w:fill="1E1E1E"/>
+          <w:lang w:val="en-US" w:eastAsia="zh-CN" w:bidi="ar"/>
+        </w:rPr>
+        <w:t>[]</w:t>
+      </w:r>
+    </w:p>
+    <w:p>
+      <w:pPr>
+        <w:keepNext w:val="0"/>
+        <w:keepLines w:val="0"/>
+        <w:widowControl/>
+        <w:suppressLineNumbers w:val="0"/>
+        <w:shd w:val="clear" w:fill="1E1E1E"/>
+        <w:spacing w:line="228" w:lineRule="atLeast"/>
+        <w:jc w:val="left"/>
+        <w:rPr>
+          <w:rFonts w:hint="default" w:ascii="Consolas" w:hAnsi="Consolas" w:eastAsia="Consolas" w:cs="Consolas"/>
+          <w:b w:val="0"/>
+          <w:bCs w:val="0"/>
+          <w:color w:val="DADADA"/>
+          <w:sz w:val="16"/>
+          <w:szCs w:val="16"/>
+        </w:rPr>
+      </w:pPr>
+      <w:r>
+        <w:rPr>
+          <w:rFonts w:hint="default" w:ascii="Consolas" w:hAnsi="Consolas" w:eastAsia="Consolas" w:cs="Consolas"/>
+          <w:b w:val="0"/>
+          <w:bCs w:val="0"/>
+          <w:color w:val="DADADA"/>
+          <w:kern w:val="0"/>
+          <w:sz w:val="16"/>
+          <w:szCs w:val="16"/>
+          <w:shd w:val="clear" w:fill="1E1E1E"/>
+          <w:lang w:val="en-US" w:eastAsia="zh-CN" w:bidi="ar"/>
+        </w:rPr>
+        <w:t xml:space="preserve">    </w:t>
+      </w:r>
+      <w:r>
+        <w:rPr>
+          <w:rFonts w:hint="default" w:ascii="Consolas" w:hAnsi="Consolas" w:eastAsia="Consolas" w:cs="Consolas"/>
+          <w:b w:val="0"/>
+          <w:bCs w:val="0"/>
+          <w:color w:val="D8A0DF"/>
+          <w:kern w:val="0"/>
+          <w:sz w:val="16"/>
+          <w:szCs w:val="16"/>
+          <w:shd w:val="clear" w:fill="1E1E1E"/>
+          <w:lang w:val="en-US" w:eastAsia="zh-CN" w:bidi="ar"/>
+        </w:rPr>
+        <w:t>for</w:t>
+      </w:r>
+      <w:r>
+        <w:rPr>
+          <w:rFonts w:hint="default" w:ascii="Consolas" w:hAnsi="Consolas" w:eastAsia="Consolas" w:cs="Consolas"/>
+          <w:b w:val="0"/>
+          <w:bCs w:val="0"/>
+          <w:color w:val="DADADA"/>
+          <w:kern w:val="0"/>
+          <w:sz w:val="16"/>
+          <w:szCs w:val="16"/>
+          <w:shd w:val="clear" w:fill="1E1E1E"/>
+          <w:lang w:val="en-US" w:eastAsia="zh-CN" w:bidi="ar"/>
+        </w:rPr>
+        <w:t xml:space="preserve"> </w:t>
+      </w:r>
+      <w:r>
+        <w:rPr>
+          <w:rFonts w:hint="default" w:ascii="Consolas" w:hAnsi="Consolas" w:eastAsia="Consolas" w:cs="Consolas"/>
+          <w:b w:val="0"/>
+          <w:bCs w:val="0"/>
+          <w:color w:val="9CDCFE"/>
+          <w:kern w:val="0"/>
+          <w:sz w:val="16"/>
+          <w:szCs w:val="16"/>
+          <w:shd w:val="clear" w:fill="1E1E1E"/>
+          <w:lang w:val="en-US" w:eastAsia="zh-CN" w:bidi="ar"/>
+        </w:rPr>
+        <w:t>i</w:t>
+      </w:r>
+      <w:r>
+        <w:rPr>
+          <w:rFonts w:hint="default" w:ascii="Consolas" w:hAnsi="Consolas" w:eastAsia="Consolas" w:cs="Consolas"/>
+          <w:b w:val="0"/>
+          <w:bCs w:val="0"/>
+          <w:color w:val="DADADA"/>
+          <w:kern w:val="0"/>
+          <w:sz w:val="16"/>
+          <w:szCs w:val="16"/>
+          <w:shd w:val="clear" w:fill="1E1E1E"/>
+          <w:lang w:val="en-US" w:eastAsia="zh-CN" w:bidi="ar"/>
+        </w:rPr>
+        <w:t xml:space="preserve"> </w:t>
+      </w:r>
+      <w:r>
+        <w:rPr>
+          <w:rFonts w:hint="default" w:ascii="Consolas" w:hAnsi="Consolas" w:eastAsia="Consolas" w:cs="Consolas"/>
+          <w:b w:val="0"/>
+          <w:bCs w:val="0"/>
+          <w:color w:val="D8A0DF"/>
+          <w:kern w:val="0"/>
+          <w:sz w:val="16"/>
+          <w:szCs w:val="16"/>
+          <w:shd w:val="clear" w:fill="1E1E1E"/>
+          <w:lang w:val="en-US" w:eastAsia="zh-CN" w:bidi="ar"/>
+        </w:rPr>
+        <w:t>in</w:t>
+      </w:r>
+      <w:r>
+        <w:rPr>
+          <w:rFonts w:hint="default" w:ascii="Consolas" w:hAnsi="Consolas" w:eastAsia="Consolas" w:cs="Consolas"/>
+          <w:b w:val="0"/>
+          <w:bCs w:val="0"/>
+          <w:color w:val="DADADA"/>
+          <w:kern w:val="0"/>
+          <w:sz w:val="16"/>
+          <w:szCs w:val="16"/>
+          <w:shd w:val="clear" w:fill="1E1E1E"/>
+          <w:lang w:val="en-US" w:eastAsia="zh-CN" w:bidi="ar"/>
+        </w:rPr>
+        <w:t xml:space="preserve"> </w:t>
+      </w:r>
+      <w:r>
+        <w:rPr>
+          <w:rFonts w:hint="default" w:ascii="Consolas" w:hAnsi="Consolas" w:eastAsia="Consolas" w:cs="Consolas"/>
+          <w:b w:val="0"/>
+          <w:bCs w:val="0"/>
+          <w:color w:val="4EC9B0"/>
+          <w:kern w:val="0"/>
+          <w:sz w:val="16"/>
+          <w:szCs w:val="16"/>
+          <w:shd w:val="clear" w:fill="1E1E1E"/>
+          <w:lang w:val="en-US" w:eastAsia="zh-CN" w:bidi="ar"/>
+        </w:rPr>
+        <w:t>range</w:t>
+      </w:r>
+      <w:r>
+        <w:rPr>
+          <w:rFonts w:hint="default" w:ascii="Consolas" w:hAnsi="Consolas" w:eastAsia="Consolas" w:cs="Consolas"/>
+          <w:b w:val="0"/>
+          <w:bCs w:val="0"/>
+          <w:color w:val="B4B4B4"/>
+          <w:kern w:val="0"/>
+          <w:sz w:val="16"/>
+          <w:szCs w:val="16"/>
+          <w:shd w:val="clear" w:fill="1E1E1E"/>
+          <w:lang w:val="en-US" w:eastAsia="zh-CN" w:bidi="ar"/>
+        </w:rPr>
+        <w:t>(</w:t>
+      </w:r>
+      <w:r>
+        <w:rPr>
+          <w:rFonts w:hint="default" w:ascii="Consolas" w:hAnsi="Consolas" w:eastAsia="Consolas" w:cs="Consolas"/>
+          <w:b w:val="0"/>
+          <w:bCs w:val="0"/>
+          <w:color w:val="B5CEA8"/>
+          <w:kern w:val="0"/>
+          <w:sz w:val="16"/>
+          <w:szCs w:val="16"/>
+          <w:shd w:val="clear" w:fill="1E1E1E"/>
+          <w:lang w:val="en-US" w:eastAsia="zh-CN" w:bidi="ar"/>
+        </w:rPr>
+        <w:t>0</w:t>
+      </w:r>
+      <w:r>
+        <w:rPr>
+          <w:rFonts w:hint="default" w:ascii="Consolas" w:hAnsi="Consolas" w:eastAsia="Consolas" w:cs="Consolas"/>
+          <w:b w:val="0"/>
+          <w:bCs w:val="0"/>
+          <w:color w:val="B4B4B4"/>
+          <w:kern w:val="0"/>
+          <w:sz w:val="16"/>
+          <w:szCs w:val="16"/>
+          <w:shd w:val="clear" w:fill="1E1E1E"/>
+          <w:lang w:val="en-US" w:eastAsia="zh-CN" w:bidi="ar"/>
+        </w:rPr>
+        <w:t>,</w:t>
+      </w:r>
+      <w:r>
+        <w:rPr>
+          <w:rFonts w:hint="default" w:ascii="Consolas" w:hAnsi="Consolas" w:eastAsia="Consolas" w:cs="Consolas"/>
+          <w:b w:val="0"/>
+          <w:bCs w:val="0"/>
+          <w:color w:val="DADADA"/>
+          <w:kern w:val="0"/>
+          <w:sz w:val="16"/>
+          <w:szCs w:val="16"/>
+          <w:shd w:val="clear" w:fill="1E1E1E"/>
+          <w:lang w:val="en-US" w:eastAsia="zh-CN" w:bidi="ar"/>
+        </w:rPr>
+        <w:t xml:space="preserve"> </w:t>
+      </w:r>
+      <w:r>
+        <w:rPr>
+          <w:rFonts w:hint="default" w:ascii="Consolas" w:hAnsi="Consolas" w:eastAsia="Consolas" w:cs="Consolas"/>
+          <w:b w:val="0"/>
+          <w:bCs w:val="0"/>
+          <w:color w:val="9A9A9A"/>
+          <w:kern w:val="0"/>
+          <w:sz w:val="16"/>
+          <w:szCs w:val="16"/>
+          <w:shd w:val="clear" w:fill="1E1E1E"/>
+          <w:lang w:val="en-US" w:eastAsia="zh-CN" w:bidi="ar"/>
+        </w:rPr>
+        <w:t>count</w:t>
+      </w:r>
+      <w:r>
+        <w:rPr>
+          <w:rFonts w:hint="default" w:ascii="Consolas" w:hAnsi="Consolas" w:eastAsia="Consolas" w:cs="Consolas"/>
+          <w:b w:val="0"/>
+          <w:bCs w:val="0"/>
+          <w:color w:val="B4B4B4"/>
+          <w:kern w:val="0"/>
+          <w:sz w:val="16"/>
+          <w:szCs w:val="16"/>
+          <w:shd w:val="clear" w:fill="1E1E1E"/>
+          <w:lang w:val="en-US" w:eastAsia="zh-CN" w:bidi="ar"/>
+        </w:rPr>
+        <w:t>):</w:t>
+      </w:r>
+    </w:p>
+    <w:p>
+      <w:pPr>
+        <w:keepNext w:val="0"/>
+        <w:keepLines w:val="0"/>
+        <w:widowControl/>
+        <w:suppressLineNumbers w:val="0"/>
+        <w:shd w:val="clear" w:fill="1E1E1E"/>
+        <w:spacing w:line="228" w:lineRule="atLeast"/>
+        <w:jc w:val="left"/>
+        <w:rPr>
+          <w:rFonts w:hint="default" w:ascii="Consolas" w:hAnsi="Consolas" w:eastAsia="Consolas" w:cs="Consolas"/>
+          <w:b w:val="0"/>
+          <w:bCs w:val="0"/>
+          <w:color w:val="DADADA"/>
+          <w:sz w:val="16"/>
+          <w:szCs w:val="16"/>
+        </w:rPr>
+      </w:pPr>
+      <w:r>
+        <w:rPr>
+          <w:rFonts w:hint="default" w:ascii="Consolas" w:hAnsi="Consolas" w:eastAsia="Consolas" w:cs="Consolas"/>
+          <w:b w:val="0"/>
+          <w:bCs w:val="0"/>
+          <w:color w:val="DADADA"/>
+          <w:kern w:val="0"/>
+          <w:sz w:val="16"/>
+          <w:szCs w:val="16"/>
+          <w:shd w:val="clear" w:fill="1E1E1E"/>
+          <w:lang w:val="en-US" w:eastAsia="zh-CN" w:bidi="ar"/>
+        </w:rPr>
+        <w:t xml:space="preserve">        </w:t>
+      </w:r>
+      <w:r>
+        <w:rPr>
+          <w:rFonts w:hint="default" w:ascii="Consolas" w:hAnsi="Consolas" w:eastAsia="Consolas" w:cs="Consolas"/>
+          <w:b w:val="0"/>
+          <w:bCs w:val="0"/>
+          <w:color w:val="9CDCFE"/>
+          <w:kern w:val="0"/>
+          <w:sz w:val="16"/>
+          <w:szCs w:val="16"/>
+          <w:shd w:val="clear" w:fill="1E1E1E"/>
+          <w:lang w:val="en-US" w:eastAsia="zh-CN" w:bidi="ar"/>
+        </w:rPr>
+        <w:t>ranum_list</w:t>
+      </w:r>
+      <w:r>
+        <w:rPr>
+          <w:rFonts w:hint="default" w:ascii="Consolas" w:hAnsi="Consolas" w:eastAsia="Consolas" w:cs="Consolas"/>
+          <w:b w:val="0"/>
+          <w:bCs w:val="0"/>
+          <w:color w:val="B4B4B4"/>
+          <w:kern w:val="0"/>
+          <w:sz w:val="16"/>
+          <w:szCs w:val="16"/>
+          <w:shd w:val="clear" w:fill="1E1E1E"/>
+          <w:lang w:val="en-US" w:eastAsia="zh-CN" w:bidi="ar"/>
+        </w:rPr>
+        <w:t>.</w:t>
+      </w:r>
+      <w:r>
+        <w:rPr>
+          <w:rFonts w:hint="default" w:ascii="Consolas" w:hAnsi="Consolas" w:eastAsia="Consolas" w:cs="Consolas"/>
+          <w:b w:val="0"/>
+          <w:bCs w:val="0"/>
+          <w:color w:val="DCDCAA"/>
+          <w:kern w:val="0"/>
+          <w:sz w:val="16"/>
+          <w:szCs w:val="16"/>
+          <w:shd w:val="clear" w:fill="1E1E1E"/>
+          <w:lang w:val="en-US" w:eastAsia="zh-CN" w:bidi="ar"/>
+        </w:rPr>
+        <w:t>append</w:t>
+      </w:r>
+      <w:r>
+        <w:rPr>
+          <w:rFonts w:hint="default" w:ascii="Consolas" w:hAnsi="Consolas" w:eastAsia="Consolas" w:cs="Consolas"/>
+          <w:b w:val="0"/>
+          <w:bCs w:val="0"/>
+          <w:color w:val="B4B4B4"/>
+          <w:kern w:val="0"/>
+          <w:sz w:val="16"/>
+          <w:szCs w:val="16"/>
+          <w:shd w:val="clear" w:fill="1E1E1E"/>
+          <w:lang w:val="en-US" w:eastAsia="zh-CN" w:bidi="ar"/>
+        </w:rPr>
+        <w:t>(</w:t>
+      </w:r>
+      <w:r>
+        <w:rPr>
+          <w:rFonts w:hint="default" w:ascii="Consolas" w:hAnsi="Consolas" w:eastAsia="Consolas" w:cs="Consolas"/>
+          <w:b w:val="0"/>
+          <w:bCs w:val="0"/>
+          <w:color w:val="C8C8C8"/>
+          <w:kern w:val="0"/>
+          <w:sz w:val="16"/>
+          <w:szCs w:val="16"/>
+          <w:shd w:val="clear" w:fill="1E1E1E"/>
+          <w:lang w:val="en-US" w:eastAsia="zh-CN" w:bidi="ar"/>
+        </w:rPr>
+        <w:t>random</w:t>
+      </w:r>
+      <w:r>
+        <w:rPr>
+          <w:rFonts w:hint="default" w:ascii="Consolas" w:hAnsi="Consolas" w:eastAsia="Consolas" w:cs="Consolas"/>
+          <w:b w:val="0"/>
+          <w:bCs w:val="0"/>
+          <w:color w:val="B4B4B4"/>
+          <w:kern w:val="0"/>
+          <w:sz w:val="16"/>
+          <w:szCs w:val="16"/>
+          <w:shd w:val="clear" w:fill="1E1E1E"/>
+          <w:lang w:val="en-US" w:eastAsia="zh-CN" w:bidi="ar"/>
+        </w:rPr>
+        <w:t>.</w:t>
+      </w:r>
+      <w:r>
+        <w:rPr>
+          <w:rFonts w:hint="default" w:ascii="Consolas" w:hAnsi="Consolas" w:eastAsia="Consolas" w:cs="Consolas"/>
+          <w:b w:val="0"/>
+          <w:bCs w:val="0"/>
+          <w:color w:val="9CDCFE"/>
+          <w:kern w:val="0"/>
+          <w:sz w:val="16"/>
+          <w:szCs w:val="16"/>
+          <w:shd w:val="clear" w:fill="1E1E1E"/>
+          <w:lang w:val="en-US" w:eastAsia="zh-CN" w:bidi="ar"/>
+        </w:rPr>
+        <w:t>randint</w:t>
+      </w:r>
+      <w:r>
+        <w:rPr>
+          <w:rFonts w:hint="default" w:ascii="Consolas" w:hAnsi="Consolas" w:eastAsia="Consolas" w:cs="Consolas"/>
+          <w:b w:val="0"/>
+          <w:bCs w:val="0"/>
+          <w:color w:val="B4B4B4"/>
+          <w:kern w:val="0"/>
+          <w:sz w:val="16"/>
+          <w:szCs w:val="16"/>
+          <w:shd w:val="clear" w:fill="1E1E1E"/>
+          <w:lang w:val="en-US" w:eastAsia="zh-CN" w:bidi="ar"/>
+        </w:rPr>
+        <w:t>(</w:t>
+      </w:r>
+      <w:r>
+        <w:rPr>
+          <w:rFonts w:hint="default" w:ascii="Consolas" w:hAnsi="Consolas" w:eastAsia="Consolas" w:cs="Consolas"/>
+          <w:b w:val="0"/>
+          <w:bCs w:val="0"/>
+          <w:color w:val="9A9A9A"/>
+          <w:kern w:val="0"/>
+          <w:sz w:val="16"/>
+          <w:szCs w:val="16"/>
+          <w:shd w:val="clear" w:fill="1E1E1E"/>
+          <w:lang w:val="en-US" w:eastAsia="zh-CN" w:bidi="ar"/>
+        </w:rPr>
+        <w:t>start</w:t>
+      </w:r>
+      <w:r>
+        <w:rPr>
+          <w:rFonts w:hint="default" w:ascii="Consolas" w:hAnsi="Consolas" w:eastAsia="Consolas" w:cs="Consolas"/>
+          <w:b w:val="0"/>
+          <w:bCs w:val="0"/>
+          <w:color w:val="B4B4B4"/>
+          <w:kern w:val="0"/>
+          <w:sz w:val="16"/>
+          <w:szCs w:val="16"/>
+          <w:shd w:val="clear" w:fill="1E1E1E"/>
+          <w:lang w:val="en-US" w:eastAsia="zh-CN" w:bidi="ar"/>
+        </w:rPr>
+        <w:t>,</w:t>
+      </w:r>
+      <w:r>
+        <w:rPr>
+          <w:rFonts w:hint="default" w:ascii="Consolas" w:hAnsi="Consolas" w:eastAsia="Consolas" w:cs="Consolas"/>
+          <w:b w:val="0"/>
+          <w:bCs w:val="0"/>
+          <w:color w:val="DADADA"/>
+          <w:kern w:val="0"/>
+          <w:sz w:val="16"/>
+          <w:szCs w:val="16"/>
+          <w:shd w:val="clear" w:fill="1E1E1E"/>
+          <w:lang w:val="en-US" w:eastAsia="zh-CN" w:bidi="ar"/>
+        </w:rPr>
+        <w:t xml:space="preserve"> </w:t>
+      </w:r>
+      <w:r>
+        <w:rPr>
+          <w:rFonts w:hint="default" w:ascii="Consolas" w:hAnsi="Consolas" w:eastAsia="Consolas" w:cs="Consolas"/>
+          <w:b w:val="0"/>
+          <w:bCs w:val="0"/>
+          <w:color w:val="9A9A9A"/>
+          <w:kern w:val="0"/>
+          <w:sz w:val="16"/>
+          <w:szCs w:val="16"/>
+          <w:shd w:val="clear" w:fill="1E1E1E"/>
+          <w:lang w:val="en-US" w:eastAsia="zh-CN" w:bidi="ar"/>
+        </w:rPr>
+        <w:t>end</w:t>
+      </w:r>
+      <w:r>
+        <w:rPr>
+          <w:rFonts w:hint="default" w:ascii="Consolas" w:hAnsi="Consolas" w:eastAsia="Consolas" w:cs="Consolas"/>
+          <w:b w:val="0"/>
+          <w:bCs w:val="0"/>
+          <w:color w:val="B4B4B4"/>
+          <w:kern w:val="0"/>
+          <w:sz w:val="16"/>
+          <w:szCs w:val="16"/>
+          <w:shd w:val="clear" w:fill="1E1E1E"/>
+          <w:lang w:val="en-US" w:eastAsia="zh-CN" w:bidi="ar"/>
+        </w:rPr>
+        <w:t>))</w:t>
+      </w:r>
+    </w:p>
+    <w:p>
+      <w:pPr>
+        <w:keepNext w:val="0"/>
+        <w:keepLines w:val="0"/>
+        <w:widowControl/>
+        <w:suppressLineNumbers w:val="0"/>
+        <w:shd w:val="clear" w:fill="1E1E1E"/>
+        <w:spacing w:line="228" w:lineRule="atLeast"/>
+        <w:jc w:val="left"/>
+        <w:rPr>
+          <w:rFonts w:hint="default"/>
+          <w:lang w:val="en-US"/>
+        </w:rPr>
+      </w:pPr>
+      <w:r>
+        <w:rPr>
+          <w:rFonts w:hint="default" w:ascii="Consolas" w:hAnsi="Consolas" w:eastAsia="Consolas" w:cs="Consolas"/>
+          <w:b w:val="0"/>
+          <w:bCs w:val="0"/>
+          <w:color w:val="DADADA"/>
+          <w:kern w:val="0"/>
+          <w:sz w:val="16"/>
+          <w:szCs w:val="16"/>
+          <w:shd w:val="clear" w:fill="1E1E1E"/>
+          <w:lang w:val="en-US" w:eastAsia="zh-CN" w:bidi="ar"/>
+        </w:rPr>
+        <w:t xml:space="preserve">    </w:t>
+      </w:r>
+      <w:r>
+        <w:rPr>
+          <w:rFonts w:hint="default" w:ascii="Consolas" w:hAnsi="Consolas" w:eastAsia="Consolas" w:cs="Consolas"/>
+          <w:b w:val="0"/>
+          <w:bCs w:val="0"/>
+          <w:color w:val="D8A0DF"/>
+          <w:kern w:val="0"/>
+          <w:sz w:val="16"/>
+          <w:szCs w:val="16"/>
+          <w:shd w:val="clear" w:fill="1E1E1E"/>
+          <w:lang w:val="en-US" w:eastAsia="zh-CN" w:bidi="ar"/>
+        </w:rPr>
+        <w:t>return</w:t>
+      </w:r>
+      <w:r>
+        <w:rPr>
+          <w:rFonts w:hint="default" w:ascii="Consolas" w:hAnsi="Consolas" w:eastAsia="Consolas" w:cs="Consolas"/>
+          <w:b w:val="0"/>
+          <w:bCs w:val="0"/>
+          <w:color w:val="DADADA"/>
+          <w:kern w:val="0"/>
+          <w:sz w:val="16"/>
+          <w:szCs w:val="16"/>
+          <w:shd w:val="clear" w:fill="1E1E1E"/>
+          <w:lang w:val="en-US" w:eastAsia="zh-CN" w:bidi="ar"/>
+        </w:rPr>
+        <w:t xml:space="preserve"> </w:t>
+      </w:r>
+      <w:r>
+        <w:rPr>
+          <w:rFonts w:hint="default" w:ascii="Consolas" w:hAnsi="Consolas" w:eastAsia="Consolas" w:cs="Consolas"/>
+          <w:b w:val="0"/>
+          <w:bCs w:val="0"/>
+          <w:color w:val="9CDCFE"/>
+          <w:kern w:val="0"/>
+          <w:sz w:val="16"/>
+          <w:szCs w:val="16"/>
+          <w:shd w:val="clear" w:fill="1E1E1E"/>
+          <w:lang w:val="en-US" w:eastAsia="zh-CN" w:bidi="ar"/>
+        </w:rPr>
+        <w:t>ranum_list</w:t>
+      </w:r>
+      <w:bookmarkStart w:id="0" w:name="_GoBack"/>
+      <w:bookmarkEnd w:id="0"/>
+    </w:p>
+    <w:p>
+      <w:pPr>
+        <w:keepNext w:val="0"/>
+        <w:keepLines w:val="0"/>
+        <w:widowControl/>
+        <w:suppressLineNumbers w:val="0"/>
+        <w:shd w:val="clear" w:fill="1E1E1E"/>
+        <w:spacing w:line="228" w:lineRule="atLeast"/>
+        <w:jc w:val="left"/>
+        <w:rPr>
+          <w:rFonts w:hint="default" w:ascii="Consolas" w:hAnsi="Consolas" w:eastAsia="Consolas" w:cs="Consolas"/>
+          <w:b w:val="0"/>
+          <w:bCs w:val="0"/>
+          <w:color w:val="DADADA"/>
+          <w:sz w:val="16"/>
+          <w:szCs w:val="16"/>
+        </w:rPr>
+      </w:pPr>
+      <w:r>
+        <w:rPr>
+          <w:rFonts w:hint="default" w:ascii="Consolas" w:hAnsi="Consolas" w:eastAsia="Consolas" w:cs="Consolas"/>
+          <w:b w:val="0"/>
+          <w:bCs w:val="0"/>
+          <w:color w:val="569CD6"/>
+          <w:kern w:val="0"/>
+          <w:sz w:val="16"/>
+          <w:szCs w:val="16"/>
+          <w:shd w:val="clear" w:fill="1E1E1E"/>
+          <w:lang w:val="en-US" w:eastAsia="zh-CN" w:bidi="ar"/>
+        </w:rPr>
+        <w:t>def</w:t>
+      </w:r>
+      <w:r>
+        <w:rPr>
+          <w:rFonts w:hint="default" w:ascii="Consolas" w:hAnsi="Consolas" w:eastAsia="Consolas" w:cs="Consolas"/>
+          <w:b w:val="0"/>
+          <w:bCs w:val="0"/>
+          <w:color w:val="DADADA"/>
+          <w:kern w:val="0"/>
+          <w:sz w:val="16"/>
+          <w:szCs w:val="16"/>
+          <w:shd w:val="clear" w:fill="1E1E1E"/>
+          <w:lang w:val="en-US" w:eastAsia="zh-CN" w:bidi="ar"/>
+        </w:rPr>
+        <w:t xml:space="preserve"> </w:t>
+      </w:r>
+      <w:r>
+        <w:rPr>
+          <w:rFonts w:hint="default" w:ascii="Consolas" w:hAnsi="Consolas" w:eastAsia="Consolas" w:cs="Consolas"/>
+          <w:b w:val="0"/>
+          <w:bCs w:val="0"/>
+          <w:color w:val="DCDCAA"/>
+          <w:kern w:val="0"/>
+          <w:sz w:val="16"/>
+          <w:szCs w:val="16"/>
+          <w:shd w:val="clear" w:fill="1E1E1E"/>
+          <w:lang w:val="en-US" w:eastAsia="zh-CN" w:bidi="ar"/>
+        </w:rPr>
+        <w:t>get_time</w:t>
+      </w:r>
+      <w:r>
+        <w:rPr>
+          <w:rFonts w:hint="default" w:ascii="Consolas" w:hAnsi="Consolas" w:eastAsia="Consolas" w:cs="Consolas"/>
+          <w:b w:val="0"/>
+          <w:bCs w:val="0"/>
+          <w:color w:val="B4B4B4"/>
+          <w:kern w:val="0"/>
+          <w:sz w:val="16"/>
+          <w:szCs w:val="16"/>
+          <w:shd w:val="clear" w:fill="1E1E1E"/>
+          <w:lang w:val="en-US" w:eastAsia="zh-CN" w:bidi="ar"/>
+        </w:rPr>
+        <w:t>():</w:t>
+      </w:r>
+    </w:p>
+    <w:p>
+      <w:pPr>
+        <w:keepNext w:val="0"/>
+        <w:keepLines w:val="0"/>
+        <w:widowControl/>
+        <w:suppressLineNumbers w:val="0"/>
+        <w:shd w:val="clear" w:fill="1E1E1E"/>
+        <w:spacing w:line="228" w:lineRule="atLeast"/>
+        <w:jc w:val="left"/>
+        <w:rPr>
+          <w:rFonts w:hint="default" w:ascii="Consolas" w:hAnsi="Consolas" w:eastAsia="Consolas" w:cs="Consolas"/>
+          <w:b w:val="0"/>
+          <w:bCs w:val="0"/>
+          <w:color w:val="DADADA"/>
+          <w:sz w:val="16"/>
+          <w:szCs w:val="16"/>
+        </w:rPr>
+      </w:pPr>
+      <w:r>
+        <w:rPr>
+          <w:rFonts w:hint="default" w:ascii="Consolas" w:hAnsi="Consolas" w:eastAsia="Consolas" w:cs="Consolas"/>
+          <w:b w:val="0"/>
+          <w:bCs w:val="0"/>
+          <w:color w:val="DADADA"/>
+          <w:kern w:val="0"/>
+          <w:sz w:val="16"/>
+          <w:szCs w:val="16"/>
+          <w:shd w:val="clear" w:fill="1E1E1E"/>
+          <w:lang w:val="en-US" w:eastAsia="zh-CN" w:bidi="ar"/>
+        </w:rPr>
+        <w:t xml:space="preserve">    </w:t>
+      </w:r>
+      <w:r>
+        <w:rPr>
+          <w:rFonts w:hint="default" w:ascii="Consolas" w:hAnsi="Consolas" w:eastAsia="Consolas" w:cs="Consolas"/>
+          <w:b w:val="0"/>
+          <w:bCs w:val="0"/>
+          <w:color w:val="D8A0DF"/>
+          <w:kern w:val="0"/>
+          <w:sz w:val="16"/>
+          <w:szCs w:val="16"/>
+          <w:shd w:val="clear" w:fill="1E1E1E"/>
+          <w:lang w:val="en-US" w:eastAsia="zh-CN" w:bidi="ar"/>
+        </w:rPr>
+        <w:t>return</w:t>
+      </w:r>
+      <w:r>
+        <w:rPr>
+          <w:rFonts w:hint="default" w:ascii="Consolas" w:hAnsi="Consolas" w:eastAsia="Consolas" w:cs="Consolas"/>
+          <w:b w:val="0"/>
+          <w:bCs w:val="0"/>
+          <w:color w:val="DADADA"/>
+          <w:kern w:val="0"/>
+          <w:sz w:val="16"/>
+          <w:szCs w:val="16"/>
+          <w:shd w:val="clear" w:fill="1E1E1E"/>
+          <w:lang w:val="en-US" w:eastAsia="zh-CN" w:bidi="ar"/>
+        </w:rPr>
+        <w:t xml:space="preserve"> </w:t>
+      </w:r>
+      <w:r>
+        <w:rPr>
+          <w:rFonts w:hint="default" w:ascii="Consolas" w:hAnsi="Consolas" w:eastAsia="Consolas" w:cs="Consolas"/>
+          <w:b w:val="0"/>
+          <w:bCs w:val="0"/>
+          <w:color w:val="C8C8C8"/>
+          <w:kern w:val="0"/>
+          <w:sz w:val="16"/>
+          <w:szCs w:val="16"/>
+          <w:shd w:val="clear" w:fill="1E1E1E"/>
+          <w:lang w:val="en-US" w:eastAsia="zh-CN" w:bidi="ar"/>
+        </w:rPr>
+        <w:t>time</w:t>
+      </w:r>
+      <w:r>
+        <w:rPr>
+          <w:rFonts w:hint="default" w:ascii="Consolas" w:hAnsi="Consolas" w:eastAsia="Consolas" w:cs="Consolas"/>
+          <w:b w:val="0"/>
+          <w:bCs w:val="0"/>
+          <w:color w:val="B4B4B4"/>
+          <w:kern w:val="0"/>
+          <w:sz w:val="16"/>
+          <w:szCs w:val="16"/>
+          <w:shd w:val="clear" w:fill="1E1E1E"/>
+          <w:lang w:val="en-US" w:eastAsia="zh-CN" w:bidi="ar"/>
+        </w:rPr>
+        <w:t>.</w:t>
+      </w:r>
+      <w:r>
+        <w:rPr>
+          <w:rFonts w:hint="default" w:ascii="Consolas" w:hAnsi="Consolas" w:eastAsia="Consolas" w:cs="Consolas"/>
+          <w:b w:val="0"/>
+          <w:bCs w:val="0"/>
+          <w:color w:val="DCDCAA"/>
+          <w:kern w:val="0"/>
+          <w:sz w:val="16"/>
+          <w:szCs w:val="16"/>
+          <w:shd w:val="clear" w:fill="1E1E1E"/>
+          <w:lang w:val="en-US" w:eastAsia="zh-CN" w:bidi="ar"/>
+        </w:rPr>
+        <w:t>time</w:t>
+      </w:r>
+      <w:r>
+        <w:rPr>
+          <w:rFonts w:hint="default" w:ascii="Consolas" w:hAnsi="Consolas" w:eastAsia="Consolas" w:cs="Consolas"/>
+          <w:b w:val="0"/>
+          <w:bCs w:val="0"/>
+          <w:color w:val="B4B4B4"/>
+          <w:kern w:val="0"/>
+          <w:sz w:val="16"/>
+          <w:szCs w:val="16"/>
+          <w:shd w:val="clear" w:fill="1E1E1E"/>
+          <w:lang w:val="en-US" w:eastAsia="zh-CN" w:bidi="ar"/>
+        </w:rPr>
+        <w:t>()</w:t>
+      </w:r>
+    </w:p>
+    <w:p>
+      <w:pPr>
+        <w:keepNext w:val="0"/>
+        <w:keepLines w:val="0"/>
+        <w:widowControl/>
+        <w:suppressLineNumbers w:val="0"/>
+        <w:spacing w:after="240" w:afterAutospacing="0"/>
+        <w:jc w:val="left"/>
+      </w:pPr>
+    </w:p>
+    <w:p>
+      <w:pPr>
+        <w:ind w:firstLine="420" w:firstLineChars="0"/>
         <w:rPr>
           <w:rFonts w:hint="default"/>
           <w:lang w:val="en-US" w:eastAsia="zh-CN"/>

</xml_diff>